<commit_message>
Record measured live sync improvement and publication verification
</commit_message>
<xml_diff>
--- a/docx/05-同步与画面流畅度优化.docx
+++ b/docx/05-同步与画面流畅度优化.docx
@@ -79,6 +79,16 @@
     <w:p>
       <w:r>
         <w:t>本轮不增加新服务或依赖。更高频同步会增加数据库请求量，暂不声称已经做容量压测。如果 RTT 持续很高，应再评估托管平台支持的常驻房间与推送方案；不能只继续压低轮询间隔。</w:t>
+      </w:r>
+    </w:p>
+    <w:p>
+      <w:r>
+        <w:t>线上实测已通过：三个客户端请求往返中位数约 363、388、381ms，快照间隔中位数约 396、485、425ms；旧版对应约 781、791、862ms。各玩家实际交付检查时为 34、34、18 EP，无 pageerror。约 150ms 的本地周期在远程网络下仍受 RTT 限制，不能宣称线上稳定 150ms。</w:t>
+      </w:r>
+    </w:p>
+    <w:p>
+      <w:r>
+        <w:t>应用已保存为 Sites 版本 4，源码提交 09ca3c123a1caf53c3225dfbacc04fbc3e193abe；GitHub CI 34747078679 成功。发布状态和公开入口资源一度不一致，重新发布后以页面实际加载的新同步逻辑和三人性能采样验收，不以平台成功状态单独作为依据。普通公开网址保持不变，已打开的页面需刷新并重新运行策略。本段仅为发布后文档记录，不改变已发布程序。</w:t>
       </w:r>
     </w:p>
     <w:sectPr>

</xml_diff>